<commit_message>
sours code and point 3 from report
</commit_message>
<xml_diff>
--- a/Report/Отчет по ПП06.docx
+++ b/Report/Отчет по ПП06.docx
@@ -9059,7 +9059,7 @@
     </w:p>
     <w:p>
       <w:pPr>
-        <w:spacing w:after="0" w:line="360" w:lineRule="auto"/>
+        <w:spacing w:after="0" w:line="480" w:lineRule="auto"/>
         <w:ind w:firstLine="709"/>
         <w:jc w:val="both"/>
         <w:rPr>
@@ -9067,30 +9067,1123 @@
           <w:kern w:val="2"/>
           <w:sz w:val="28"/>
           <w:szCs w:val="28"/>
+          <w:lang w:val="en-US"/>
           <w14:ligatures w14:val="standardContextual"/>
         </w:rPr>
       </w:pPr>
-    </w:p>
-    <w:p>
-      <w:pPr>
-        <w:spacing w:after="0" w:line="480" w:lineRule="auto"/>
-        <w:ind w:firstLine="709"/>
-        <w:jc w:val="both"/>
-        <w:rPr>
-          <w:rFonts w:ascii="Times New Roman" w:hAnsi="Times New Roman" w:cs="Times New Roman"/>
-          <w:sz w:val="28"/>
-          <w:szCs w:val="28"/>
-        </w:rPr>
-      </w:pPr>
-    </w:p>
-    <w:p>
-      <w:pPr>
-        <w:spacing w:after="120" w:line="360" w:lineRule="auto"/>
-        <w:jc w:val="center"/>
-        <w:rPr>
-          <w:rFonts w:ascii="Times New Roman" w:hAnsi="Times New Roman" w:cs="Times New Roman"/>
-          <w:sz w:val="28"/>
-          <w:szCs w:val="28"/>
+      <w:r>
+        <w:rPr>
+          <w:rFonts w:ascii="Times New Roman" w:eastAsia="Aptos" w:hAnsi="Times New Roman" w:cs="Times New Roman"/>
+          <w:kern w:val="2"/>
+          <w:sz w:val="28"/>
+          <w:szCs w:val="28"/>
+          <w14:ligatures w14:val="standardContextual"/>
+        </w:rPr>
+        <w:t xml:space="preserve"> </w:t>
+      </w:r>
+      <w:r>
+        <w:rPr>
+          <w:rFonts w:ascii="Times New Roman" w:eastAsia="Aptos" w:hAnsi="Times New Roman" w:cs="Times New Roman"/>
+          <w:kern w:val="2"/>
+          <w:sz w:val="28"/>
+          <w:szCs w:val="28"/>
+          <w:lang w:val="en-US"/>
+          <w14:ligatures w14:val="standardContextual"/>
+        </w:rPr>
+        <w:t xml:space="preserve">   </w:t>
+      </w:r>
+    </w:p>
+    <w:p>
+      <w:pPr>
+        <w:spacing w:after="0" w:line="360" w:lineRule="auto"/>
+        <w:ind w:left="709"/>
+        <w:outlineLvl w:val="1"/>
+        <w:rPr>
+          <w:rFonts w:ascii="Times New Roman" w:eastAsia="Aptos" w:hAnsi="Times New Roman" w:cs="Times New Roman"/>
+          <w:kern w:val="2"/>
+          <w:sz w:val="28"/>
+          <w:szCs w:val="28"/>
+          <w14:ligatures w14:val="standardContextual"/>
+        </w:rPr>
+      </w:pPr>
+      <w:r>
+        <w:rPr>
+          <w:rFonts w:ascii="Times New Roman" w:eastAsia="Aptos" w:hAnsi="Times New Roman" w:cs="Times New Roman"/>
+          <w:kern w:val="2"/>
+          <w:sz w:val="28"/>
+          <w:szCs w:val="28"/>
+          <w14:ligatures w14:val="standardContextual"/>
+        </w:rPr>
+        <w:t xml:space="preserve">2 </w:t>
+      </w:r>
+      <w:r>
+        <w:rPr>
+          <w:rFonts w:ascii="Times New Roman" w:eastAsia="Aptos" w:hAnsi="Times New Roman" w:cs="Times New Roman"/>
+          <w:kern w:val="2"/>
+          <w:sz w:val="28"/>
+          <w:szCs w:val="28"/>
+          <w14:ligatures w14:val="standardContextual"/>
+        </w:rPr>
+        <w:t>Практтиические задания</w:t>
+      </w:r>
+    </w:p>
+    <w:p>
+      <w:pPr>
+        <w:spacing w:after="0" w:line="240" w:lineRule="auto"/>
+        <w:ind w:firstLine="709"/>
+        <w:jc w:val="both"/>
+        <w:rPr>
+          <w:rFonts w:ascii="Times New Roman" w:eastAsia="Aptos" w:hAnsi="Times New Roman" w:cs="Times New Roman"/>
+          <w:kern w:val="2"/>
+          <w:sz w:val="32"/>
+          <w:szCs w:val="32"/>
+          <w14:ligatures w14:val="standardContextual"/>
+        </w:rPr>
+      </w:pPr>
+    </w:p>
+    <w:p>
+      <w:pPr>
+        <w:pStyle w:val="aa"/>
+        <w:spacing w:before="0" w:beforeAutospacing="0" w:after="0" w:afterAutospacing="0" w:line="360" w:lineRule="auto"/>
+        <w:ind w:firstLine="709"/>
+        <w:rPr>
+          <w:sz w:val="28"/>
+          <w:szCs w:val="28"/>
+        </w:rPr>
+      </w:pPr>
+      <w:r>
+        <w:rPr>
+          <w:sz w:val="28"/>
+          <w:szCs w:val="28"/>
+        </w:rPr>
+        <w:t>2.1 Установка и настройка программного обеспечения</w:t>
+      </w:r>
+    </w:p>
+    <w:p>
+      <w:pPr>
+        <w:pStyle w:val="aa"/>
+        <w:spacing w:before="0" w:beforeAutospacing="0" w:after="0" w:afterAutospacing="0" w:line="360" w:lineRule="auto"/>
+        <w:ind w:firstLine="709"/>
+        <w:rPr>
+          <w:sz w:val="28"/>
+          <w:szCs w:val="28"/>
+        </w:rPr>
+      </w:pPr>
+    </w:p>
+    <w:p>
+      <w:pPr>
+        <w:pStyle w:val="aa"/>
+        <w:spacing w:before="0" w:beforeAutospacing="0" w:after="0" w:afterAutospacing="0" w:line="360" w:lineRule="auto"/>
+        <w:ind w:firstLine="709"/>
+        <w:rPr>
+          <w:sz w:val="28"/>
+          <w:szCs w:val="28"/>
+        </w:rPr>
+      </w:pPr>
+      <w:r>
+        <w:rPr>
+          <w:sz w:val="28"/>
+          <w:szCs w:val="28"/>
+        </w:rPr>
+        <w:t>В период прохождения производственной практики была выполнена установка и настройка программного обеспечения, необходимого для разработки и сопровождения Web API-приложения «Модуль обработки и работы с изображениями». Для реализации проекта использовался язык программирования Python и фреймворк FastAPI.</w:t>
+      </w:r>
+    </w:p>
+    <w:p>
+      <w:pPr>
+        <w:pStyle w:val="aa"/>
+        <w:spacing w:before="0" w:beforeAutospacing="0" w:after="0" w:afterAutospacing="0" w:line="360" w:lineRule="auto"/>
+        <w:ind w:firstLine="709"/>
+        <w:rPr>
+          <w:sz w:val="28"/>
+          <w:szCs w:val="28"/>
+        </w:rPr>
+      </w:pPr>
+      <w:r>
+        <w:rPr>
+          <w:sz w:val="28"/>
+          <w:szCs w:val="28"/>
+        </w:rPr>
+        <w:t>В ходе работы была установлена и настроена среда разработки Visual Studio Code, а также выполнена установка интерпретатора Python и необходимых библиотек для работы с API, обработки изображений и взаимодействия с базой данных. Для хранения информации об изображениях была выбрана база данных SQLite. Дополнительно была организована структура проекта, включающая основные программные модули и директории для хранения изображений.</w:t>
+      </w:r>
+    </w:p>
+    <w:p>
+      <w:pPr>
+        <w:pStyle w:val="aa"/>
+        <w:spacing w:before="0" w:beforeAutospacing="0" w:after="0" w:afterAutospacing="0" w:line="360" w:lineRule="auto"/>
+        <w:ind w:firstLine="709"/>
+        <w:rPr>
+          <w:sz w:val="28"/>
+          <w:szCs w:val="28"/>
+        </w:rPr>
+      </w:pPr>
+      <w:r>
+        <w:rPr>
+          <w:sz w:val="28"/>
+          <w:szCs w:val="28"/>
+        </w:rPr>
+        <w:t>Исходный код проекта представлен в приложении к отчету.</w:t>
+      </w:r>
+    </w:p>
+    <w:p>
+      <w:pPr>
+        <w:pStyle w:val="aa"/>
+        <w:spacing w:before="0" w:beforeAutospacing="0" w:after="0" w:afterAutospacing="0" w:line="480" w:lineRule="auto"/>
+        <w:ind w:firstLine="709"/>
+        <w:rPr>
+          <w:sz w:val="28"/>
+          <w:szCs w:val="28"/>
+        </w:rPr>
+      </w:pPr>
+    </w:p>
+    <w:p>
+      <w:pPr>
+        <w:pStyle w:val="aa"/>
+        <w:spacing w:before="0" w:beforeAutospacing="0" w:after="0" w:afterAutospacing="0" w:line="480" w:lineRule="auto"/>
+        <w:ind w:firstLine="709"/>
+        <w:rPr>
+          <w:sz w:val="28"/>
+          <w:szCs w:val="28"/>
+        </w:rPr>
+      </w:pPr>
+    </w:p>
+    <w:p>
+      <w:pPr>
+        <w:pStyle w:val="aa"/>
+        <w:spacing w:before="0" w:beforeAutospacing="0" w:after="0" w:afterAutospacing="0" w:line="360" w:lineRule="auto"/>
+        <w:ind w:firstLine="709"/>
+        <w:rPr>
+          <w:sz w:val="28"/>
+          <w:szCs w:val="28"/>
+        </w:rPr>
+      </w:pPr>
+      <w:r>
+        <w:rPr>
+          <w:sz w:val="28"/>
+          <w:szCs w:val="28"/>
+        </w:rPr>
+        <w:lastRenderedPageBreak/>
+        <w:t>2.2 Устранение инцидентов</w:t>
+      </w:r>
+    </w:p>
+    <w:p>
+      <w:pPr>
+        <w:pStyle w:val="aa"/>
+        <w:spacing w:before="0" w:beforeAutospacing="0" w:after="0" w:afterAutospacing="0" w:line="360" w:lineRule="auto"/>
+        <w:ind w:firstLine="709"/>
+        <w:rPr>
+          <w:sz w:val="28"/>
+          <w:szCs w:val="28"/>
+        </w:rPr>
+      </w:pPr>
+    </w:p>
+    <w:p>
+      <w:pPr>
+        <w:pStyle w:val="aa"/>
+        <w:spacing w:before="0" w:beforeAutospacing="0" w:after="0" w:afterAutospacing="0" w:line="360" w:lineRule="auto"/>
+        <w:ind w:firstLine="709"/>
+        <w:rPr>
+          <w:sz w:val="28"/>
+          <w:szCs w:val="28"/>
+        </w:rPr>
+      </w:pPr>
+      <w:r>
+        <w:rPr>
+          <w:sz w:val="28"/>
+          <w:szCs w:val="28"/>
+        </w:rPr>
+        <w:t>Во время выполнения практической работы возникали отдельные ошибки и технические сложности, связанные с запуском и настройкой программного обеспечения.</w:t>
+      </w:r>
+    </w:p>
+    <w:p>
+      <w:pPr>
+        <w:pStyle w:val="aa"/>
+        <w:spacing w:before="0" w:beforeAutospacing="0" w:after="0" w:afterAutospacing="0" w:line="360" w:lineRule="auto"/>
+        <w:ind w:firstLine="709"/>
+        <w:rPr>
+          <w:sz w:val="28"/>
+          <w:szCs w:val="28"/>
+        </w:rPr>
+      </w:pPr>
+      <w:r>
+        <w:rPr>
+          <w:sz w:val="28"/>
+          <w:szCs w:val="28"/>
+        </w:rPr>
+        <w:t>Одной из проблем стала ошибка выполнения команды установки библиотек Python через PowerShell, связанная с отсутствием доступа к команде pip. Для устранения проблемы использовался запуск установки через интерпретатор Python.</w:t>
+      </w:r>
+    </w:p>
+    <w:p>
+      <w:pPr>
+        <w:pStyle w:val="aa"/>
+        <w:spacing w:before="0" w:beforeAutospacing="0" w:after="0" w:afterAutospacing="0" w:line="360" w:lineRule="auto"/>
+        <w:ind w:firstLine="709"/>
+        <w:rPr>
+          <w:sz w:val="28"/>
+          <w:szCs w:val="28"/>
+        </w:rPr>
+      </w:pPr>
+      <w:r>
+        <w:rPr>
+          <w:sz w:val="28"/>
+          <w:szCs w:val="28"/>
+        </w:rPr>
+        <w:t>Также возникала ошибка запуска FastAPI-приложения, вызванная синтаксическими ошибками в файле main.py и некорректным оформлением комментариев. После проверки структуры проекта и исправления ошибок приложение было успешно запущено.</w:t>
+      </w:r>
+    </w:p>
+    <w:p>
+      <w:pPr>
+        <w:pStyle w:val="aa"/>
+        <w:spacing w:before="0" w:beforeAutospacing="0" w:after="0" w:afterAutospacing="0" w:line="360" w:lineRule="auto"/>
+        <w:ind w:firstLine="709"/>
+        <w:rPr>
+          <w:sz w:val="28"/>
+          <w:szCs w:val="28"/>
+        </w:rPr>
+      </w:pPr>
+      <w:r>
+        <w:rPr>
+          <w:sz w:val="28"/>
+          <w:szCs w:val="28"/>
+        </w:rPr>
+        <w:t>Дополнительно проводилось тестирование API-методов, отвечающих за загрузку изображений, изменение размера и поворот изображений.</w:t>
+      </w:r>
+    </w:p>
+    <w:p>
+      <w:pPr>
+        <w:pStyle w:val="aa"/>
+        <w:spacing w:before="0" w:beforeAutospacing="0" w:after="0" w:afterAutospacing="0" w:line="360" w:lineRule="auto"/>
+        <w:ind w:firstLine="709"/>
+        <w:rPr>
+          <w:sz w:val="28"/>
+          <w:szCs w:val="28"/>
+        </w:rPr>
+      </w:pPr>
+      <w:r>
+        <w:rPr>
+          <w:sz w:val="28"/>
+          <w:szCs w:val="28"/>
+        </w:rPr>
+        <w:t>Листинг основных программных модулей приведен в приложении к отчету.</w:t>
+      </w:r>
+    </w:p>
+    <w:p>
+      <w:pPr>
+        <w:pStyle w:val="aa"/>
+        <w:spacing w:before="0" w:beforeAutospacing="0" w:after="0" w:afterAutospacing="0" w:line="480" w:lineRule="auto"/>
+        <w:ind w:firstLine="709"/>
+        <w:rPr>
+          <w:sz w:val="28"/>
+          <w:szCs w:val="28"/>
+        </w:rPr>
+      </w:pPr>
+    </w:p>
+    <w:p>
+      <w:pPr>
+        <w:pStyle w:val="aa"/>
+        <w:spacing w:before="0" w:beforeAutospacing="0" w:after="0" w:afterAutospacing="0" w:line="360" w:lineRule="auto"/>
+        <w:ind w:firstLine="709"/>
+        <w:rPr>
+          <w:sz w:val="28"/>
+          <w:szCs w:val="28"/>
+        </w:rPr>
+      </w:pPr>
+      <w:r>
+        <w:rPr>
+          <w:sz w:val="28"/>
+          <w:szCs w:val="28"/>
+        </w:rPr>
+        <w:t>2.3 Резервное копирование данных</w:t>
+      </w:r>
+    </w:p>
+    <w:p>
+      <w:pPr>
+        <w:pStyle w:val="aa"/>
+        <w:spacing w:before="0" w:beforeAutospacing="0" w:after="0" w:afterAutospacing="0" w:line="360" w:lineRule="auto"/>
+        <w:ind w:firstLine="709"/>
+        <w:rPr>
+          <w:sz w:val="28"/>
+          <w:szCs w:val="28"/>
+        </w:rPr>
+      </w:pPr>
+    </w:p>
+    <w:p>
+      <w:pPr>
+        <w:pStyle w:val="aa"/>
+        <w:spacing w:before="0" w:beforeAutospacing="0" w:after="0" w:afterAutospacing="0" w:line="360" w:lineRule="auto"/>
+        <w:ind w:firstLine="709"/>
+        <w:rPr>
+          <w:sz w:val="28"/>
+          <w:szCs w:val="28"/>
+        </w:rPr>
+      </w:pPr>
+      <w:r>
+        <w:rPr>
+          <w:sz w:val="28"/>
+          <w:szCs w:val="28"/>
+        </w:rPr>
+        <w:t>В процессе разработки выполнялось резервное копирование файлов проекта и базы данных SQLite. Для хранения изображений использовалась отдельная директория проекта, а база данных сохранялась в виде отдельного файла database.db.</w:t>
+      </w:r>
+    </w:p>
+    <w:p>
+      <w:pPr>
+        <w:pStyle w:val="aa"/>
+        <w:spacing w:before="0" w:beforeAutospacing="0" w:after="0" w:afterAutospacing="0" w:line="360" w:lineRule="auto"/>
+        <w:ind w:firstLine="709"/>
+        <w:rPr>
+          <w:sz w:val="28"/>
+          <w:szCs w:val="28"/>
+        </w:rPr>
+      </w:pPr>
+      <w:r>
+        <w:rPr>
+          <w:sz w:val="28"/>
+          <w:szCs w:val="28"/>
+        </w:rPr>
+        <w:t>Резервное копирование обеспечивало сохранность данных и позволяло восстановить проект в случае возникновения ошибок или повреждения файлов.</w:t>
+      </w:r>
+    </w:p>
+    <w:p>
+      <w:pPr>
+        <w:pStyle w:val="aa"/>
+        <w:spacing w:before="0" w:beforeAutospacing="0" w:after="0" w:afterAutospacing="0" w:line="360" w:lineRule="auto"/>
+        <w:ind w:firstLine="709"/>
+        <w:rPr>
+          <w:sz w:val="28"/>
+          <w:szCs w:val="28"/>
+        </w:rPr>
+      </w:pPr>
+      <w:r>
+        <w:rPr>
+          <w:sz w:val="28"/>
+          <w:szCs w:val="28"/>
+        </w:rPr>
+        <w:t>Примеры структуры проекта и используемых файлов представлены в приложении.</w:t>
+      </w:r>
+    </w:p>
+    <w:p>
+      <w:pPr>
+        <w:pStyle w:val="aa"/>
+        <w:spacing w:before="0" w:beforeAutospacing="0" w:after="0" w:afterAutospacing="0" w:line="360" w:lineRule="auto"/>
+        <w:ind w:firstLine="709"/>
+        <w:rPr>
+          <w:sz w:val="28"/>
+          <w:szCs w:val="28"/>
+        </w:rPr>
+      </w:pPr>
+      <w:r>
+        <w:rPr>
+          <w:sz w:val="28"/>
+          <w:szCs w:val="28"/>
+        </w:rPr>
+        <w:lastRenderedPageBreak/>
+        <w:t>2.4 Составление отчетов и документации</w:t>
+      </w:r>
+    </w:p>
+    <w:p>
+      <w:pPr>
+        <w:pStyle w:val="aa"/>
+        <w:spacing w:before="0" w:beforeAutospacing="0" w:after="0" w:afterAutospacing="0" w:line="360" w:lineRule="auto"/>
+        <w:ind w:firstLine="709"/>
+        <w:rPr>
+          <w:sz w:val="28"/>
+          <w:szCs w:val="28"/>
+        </w:rPr>
+      </w:pPr>
+      <w:r>
+        <w:rPr>
+          <w:sz w:val="28"/>
+          <w:szCs w:val="28"/>
+        </w:rPr>
+        <w:t>В ходе практики велась подготовка отчетной документации по выполненным работам. Были описаны этапы разработки API-приложения, используемые технологии и реализованные функции обработки изображений.</w:t>
+      </w:r>
+    </w:p>
+    <w:p>
+      <w:pPr>
+        <w:pStyle w:val="aa"/>
+        <w:spacing w:before="0" w:beforeAutospacing="0" w:after="0" w:afterAutospacing="0" w:line="360" w:lineRule="auto"/>
+        <w:ind w:firstLine="709"/>
+        <w:rPr>
+          <w:sz w:val="28"/>
+          <w:szCs w:val="28"/>
+        </w:rPr>
+      </w:pPr>
+      <w:r>
+        <w:rPr>
+          <w:sz w:val="28"/>
+          <w:szCs w:val="28"/>
+        </w:rPr>
+        <w:t>Также была составлена инструкция по запуску приложения, настройке среды разработки и тестированию API через Swagger-интерфейс FastAPI.</w:t>
+      </w:r>
+    </w:p>
+    <w:p>
+      <w:pPr>
+        <w:pStyle w:val="aa"/>
+        <w:spacing w:before="0" w:beforeAutospacing="0" w:after="0" w:afterAutospacing="0" w:line="360" w:lineRule="auto"/>
+        <w:ind w:firstLine="709"/>
+        <w:rPr>
+          <w:sz w:val="28"/>
+          <w:szCs w:val="28"/>
+        </w:rPr>
+      </w:pPr>
+      <w:r>
+        <w:rPr>
+          <w:sz w:val="28"/>
+          <w:szCs w:val="28"/>
+        </w:rPr>
+        <w:t>Фрагменты программного кода и результаты тестирования представлены в приложении к отчету.</w:t>
+      </w:r>
+    </w:p>
+    <w:p>
+      <w:pPr>
+        <w:pStyle w:val="aa"/>
+        <w:spacing w:before="0" w:beforeAutospacing="0" w:after="0" w:afterAutospacing="0" w:line="480" w:lineRule="auto"/>
+        <w:ind w:firstLine="709"/>
+        <w:rPr>
+          <w:sz w:val="28"/>
+          <w:szCs w:val="28"/>
+        </w:rPr>
+      </w:pPr>
+    </w:p>
+    <w:p>
+      <w:pPr>
+        <w:pStyle w:val="aa"/>
+        <w:spacing w:before="0" w:beforeAutospacing="0" w:after="0" w:afterAutospacing="0" w:line="360" w:lineRule="auto"/>
+        <w:ind w:firstLine="709"/>
+        <w:rPr>
+          <w:sz w:val="28"/>
+          <w:szCs w:val="28"/>
+        </w:rPr>
+      </w:pPr>
+      <w:r>
+        <w:rPr>
+          <w:sz w:val="28"/>
+          <w:szCs w:val="28"/>
+        </w:rPr>
+        <w:t>2.5 Используемые инструменты и технологии</w:t>
+      </w:r>
+    </w:p>
+    <w:p>
+      <w:pPr>
+        <w:pStyle w:val="aa"/>
+        <w:spacing w:before="0" w:beforeAutospacing="0" w:after="0" w:afterAutospacing="0" w:line="360" w:lineRule="auto"/>
+        <w:ind w:firstLine="709"/>
+        <w:rPr>
+          <w:sz w:val="28"/>
+          <w:szCs w:val="28"/>
+        </w:rPr>
+      </w:pPr>
+    </w:p>
+    <w:p>
+      <w:pPr>
+        <w:pStyle w:val="aa"/>
+        <w:spacing w:before="0" w:beforeAutospacing="0" w:after="0" w:afterAutospacing="0" w:line="360" w:lineRule="auto"/>
+        <w:ind w:firstLine="709"/>
+        <w:rPr>
+          <w:sz w:val="28"/>
+          <w:szCs w:val="28"/>
+        </w:rPr>
+      </w:pPr>
+      <w:r>
+        <w:rPr>
+          <w:sz w:val="28"/>
+          <w:szCs w:val="28"/>
+        </w:rPr>
+        <w:t>При выполнении практического задания использовались следующие инструменты и технологии:</w:t>
+      </w:r>
+    </w:p>
+    <w:p>
+      <w:pPr>
+        <w:pStyle w:val="aa"/>
+        <w:numPr>
+          <w:ilvl w:val="0"/>
+          <w:numId w:val="35"/>
+        </w:numPr>
+        <w:spacing w:before="0" w:beforeAutospacing="0" w:after="0" w:afterAutospacing="0" w:line="360" w:lineRule="auto"/>
+        <w:ind w:left="0" w:firstLine="0"/>
+        <w:rPr>
+          <w:sz w:val="28"/>
+          <w:szCs w:val="28"/>
+          <w:lang w:val="en-US"/>
+        </w:rPr>
+      </w:pPr>
+      <w:r>
+        <w:rPr>
+          <w:sz w:val="28"/>
+          <w:szCs w:val="28"/>
+          <w:lang w:val="en-US"/>
+        </w:rPr>
+        <w:t>Python;</w:t>
+      </w:r>
+    </w:p>
+    <w:p>
+      <w:pPr>
+        <w:pStyle w:val="aa"/>
+        <w:numPr>
+          <w:ilvl w:val="0"/>
+          <w:numId w:val="35"/>
+        </w:numPr>
+        <w:spacing w:before="0" w:beforeAutospacing="0" w:after="0" w:afterAutospacing="0" w:line="360" w:lineRule="auto"/>
+        <w:ind w:left="0" w:firstLine="0"/>
+        <w:rPr>
+          <w:sz w:val="28"/>
+          <w:szCs w:val="28"/>
+          <w:lang w:val="en-US"/>
+        </w:rPr>
+      </w:pPr>
+      <w:r>
+        <w:rPr>
+          <w:sz w:val="28"/>
+          <w:szCs w:val="28"/>
+          <w:lang w:val="en-US"/>
+        </w:rPr>
+        <w:t>FastAPI;</w:t>
+      </w:r>
+    </w:p>
+    <w:p>
+      <w:pPr>
+        <w:pStyle w:val="aa"/>
+        <w:numPr>
+          <w:ilvl w:val="0"/>
+          <w:numId w:val="35"/>
+        </w:numPr>
+        <w:spacing w:before="0" w:beforeAutospacing="0" w:after="0" w:afterAutospacing="0" w:line="360" w:lineRule="auto"/>
+        <w:ind w:left="0" w:firstLine="0"/>
+        <w:rPr>
+          <w:sz w:val="28"/>
+          <w:szCs w:val="28"/>
+          <w:lang w:val="en-US"/>
+        </w:rPr>
+      </w:pPr>
+      <w:r>
+        <w:rPr>
+          <w:sz w:val="28"/>
+          <w:szCs w:val="28"/>
+          <w:lang w:val="en-US"/>
+        </w:rPr>
+        <w:t>SQLite;</w:t>
+      </w:r>
+    </w:p>
+    <w:p>
+      <w:pPr>
+        <w:pStyle w:val="aa"/>
+        <w:numPr>
+          <w:ilvl w:val="0"/>
+          <w:numId w:val="35"/>
+        </w:numPr>
+        <w:spacing w:before="0" w:beforeAutospacing="0" w:after="0" w:afterAutospacing="0" w:line="360" w:lineRule="auto"/>
+        <w:ind w:left="0" w:firstLine="0"/>
+        <w:rPr>
+          <w:sz w:val="28"/>
+          <w:szCs w:val="28"/>
+          <w:lang w:val="en-US"/>
+        </w:rPr>
+      </w:pPr>
+      <w:r>
+        <w:rPr>
+          <w:sz w:val="28"/>
+          <w:szCs w:val="28"/>
+          <w:lang w:val="en-US"/>
+        </w:rPr>
+        <w:t>Pillow;</w:t>
+      </w:r>
+    </w:p>
+    <w:p>
+      <w:pPr>
+        <w:pStyle w:val="aa"/>
+        <w:numPr>
+          <w:ilvl w:val="0"/>
+          <w:numId w:val="35"/>
+        </w:numPr>
+        <w:spacing w:before="0" w:beforeAutospacing="0" w:after="0" w:afterAutospacing="0" w:line="360" w:lineRule="auto"/>
+        <w:ind w:left="0" w:firstLine="0"/>
+        <w:rPr>
+          <w:sz w:val="28"/>
+          <w:szCs w:val="28"/>
+          <w:lang w:val="en-US"/>
+        </w:rPr>
+      </w:pPr>
+      <w:r>
+        <w:rPr>
+          <w:sz w:val="28"/>
+          <w:szCs w:val="28"/>
+          <w:lang w:val="en-US"/>
+        </w:rPr>
+        <w:t>Uvicorn;</w:t>
+      </w:r>
+    </w:p>
+    <w:p>
+      <w:pPr>
+        <w:pStyle w:val="aa"/>
+        <w:numPr>
+          <w:ilvl w:val="0"/>
+          <w:numId w:val="35"/>
+        </w:numPr>
+        <w:spacing w:before="0" w:beforeAutospacing="0" w:after="0" w:afterAutospacing="0" w:line="360" w:lineRule="auto"/>
+        <w:ind w:left="0" w:firstLine="0"/>
+        <w:rPr>
+          <w:sz w:val="28"/>
+          <w:szCs w:val="28"/>
+          <w:lang w:val="en-US"/>
+        </w:rPr>
+      </w:pPr>
+      <w:r>
+        <w:rPr>
+          <w:sz w:val="28"/>
+          <w:szCs w:val="28"/>
+          <w:lang w:val="en-US"/>
+        </w:rPr>
+        <w:t>Visual Studio Code;</w:t>
+      </w:r>
+    </w:p>
+    <w:p>
+      <w:pPr>
+        <w:pStyle w:val="aa"/>
+        <w:numPr>
+          <w:ilvl w:val="0"/>
+          <w:numId w:val="35"/>
+        </w:numPr>
+        <w:spacing w:before="0" w:beforeAutospacing="0" w:after="0" w:afterAutospacing="0" w:line="360" w:lineRule="auto"/>
+        <w:ind w:left="0" w:firstLine="0"/>
+        <w:rPr>
+          <w:sz w:val="28"/>
+          <w:szCs w:val="28"/>
+          <w:lang w:val="en-US"/>
+        </w:rPr>
+      </w:pPr>
+      <w:r>
+        <w:rPr>
+          <w:sz w:val="28"/>
+          <w:szCs w:val="28"/>
+          <w:lang w:val="en-US"/>
+        </w:rPr>
+        <w:t>Swagger UI;</w:t>
+      </w:r>
+    </w:p>
+    <w:p>
+      <w:pPr>
+        <w:pStyle w:val="aa"/>
+        <w:numPr>
+          <w:ilvl w:val="0"/>
+          <w:numId w:val="35"/>
+        </w:numPr>
+        <w:spacing w:before="0" w:beforeAutospacing="0" w:after="0" w:afterAutospacing="0" w:line="360" w:lineRule="auto"/>
+        <w:ind w:left="0" w:firstLine="0"/>
+        <w:rPr>
+          <w:sz w:val="28"/>
+          <w:szCs w:val="28"/>
+        </w:rPr>
+      </w:pPr>
+      <w:r>
+        <w:rPr>
+          <w:sz w:val="28"/>
+          <w:szCs w:val="28"/>
+        </w:rPr>
+        <w:t>Git и GitHub для контроля версий проекта.</w:t>
+      </w:r>
+    </w:p>
+    <w:p>
+      <w:pPr>
+        <w:pStyle w:val="aa"/>
+        <w:spacing w:before="0" w:beforeAutospacing="0" w:after="0" w:afterAutospacing="0" w:line="360" w:lineRule="auto"/>
+        <w:ind w:firstLine="709"/>
+        <w:rPr>
+          <w:sz w:val="28"/>
+          <w:szCs w:val="28"/>
+        </w:rPr>
+      </w:pPr>
+      <w:r>
+        <w:rPr>
+          <w:sz w:val="28"/>
+          <w:szCs w:val="28"/>
+        </w:rPr>
+        <w:t>Использование данных технологий позволило реализовать API-приложение для обработки изображений и организовать взаимодействие с базой данных.</w:t>
+      </w:r>
+    </w:p>
+    <w:p>
+      <w:pPr>
+        <w:pStyle w:val="aa"/>
+        <w:spacing w:before="0" w:beforeAutospacing="0" w:after="0" w:afterAutospacing="0" w:line="360" w:lineRule="auto"/>
+        <w:ind w:firstLine="709"/>
+        <w:rPr>
+          <w:sz w:val="28"/>
+          <w:szCs w:val="28"/>
+        </w:rPr>
+      </w:pPr>
+      <w:r>
+        <w:rPr>
+          <w:sz w:val="28"/>
+          <w:szCs w:val="28"/>
+        </w:rPr>
+        <w:t>Примеры реализации основных функций приведены в приложении.</w:t>
+      </w:r>
+    </w:p>
+    <w:p>
+      <w:pPr>
+        <w:pStyle w:val="aa"/>
+        <w:spacing w:before="0" w:beforeAutospacing="0" w:after="0" w:afterAutospacing="0" w:line="480" w:lineRule="auto"/>
+        <w:ind w:firstLine="709"/>
+        <w:rPr>
+          <w:sz w:val="28"/>
+          <w:szCs w:val="28"/>
+        </w:rPr>
+      </w:pPr>
+    </w:p>
+    <w:p>
+      <w:pPr>
+        <w:pStyle w:val="aa"/>
+        <w:spacing w:before="0" w:beforeAutospacing="0" w:after="0" w:afterAutospacing="0" w:line="360" w:lineRule="auto"/>
+        <w:ind w:firstLine="709"/>
+        <w:rPr>
+          <w:sz w:val="28"/>
+          <w:szCs w:val="28"/>
+        </w:rPr>
+      </w:pPr>
+    </w:p>
+    <w:p>
+      <w:pPr>
+        <w:pStyle w:val="aa"/>
+        <w:spacing w:before="0" w:beforeAutospacing="0" w:after="0" w:afterAutospacing="0" w:line="360" w:lineRule="auto"/>
+        <w:ind w:firstLine="709"/>
+        <w:rPr>
+          <w:sz w:val="28"/>
+          <w:szCs w:val="28"/>
+        </w:rPr>
+      </w:pPr>
+    </w:p>
+    <w:p>
+      <w:pPr>
+        <w:pStyle w:val="aa"/>
+        <w:spacing w:before="0" w:beforeAutospacing="0" w:after="0" w:afterAutospacing="0" w:line="360" w:lineRule="auto"/>
+        <w:ind w:firstLine="709"/>
+        <w:rPr>
+          <w:sz w:val="28"/>
+          <w:szCs w:val="28"/>
+        </w:rPr>
+      </w:pPr>
+      <w:r>
+        <w:rPr>
+          <w:sz w:val="28"/>
+          <w:szCs w:val="28"/>
+        </w:rPr>
+        <w:lastRenderedPageBreak/>
+        <w:t>2.6 Взаимодействие с сотрудниками и отделами компании</w:t>
+      </w:r>
+    </w:p>
+    <w:p>
+      <w:pPr>
+        <w:pStyle w:val="aa"/>
+        <w:spacing w:before="0" w:beforeAutospacing="0" w:after="0" w:afterAutospacing="0" w:line="360" w:lineRule="auto"/>
+        <w:ind w:firstLine="709"/>
+        <w:rPr>
+          <w:sz w:val="28"/>
+          <w:szCs w:val="28"/>
+        </w:rPr>
+      </w:pPr>
+    </w:p>
+    <w:p>
+      <w:pPr>
+        <w:pStyle w:val="aa"/>
+        <w:spacing w:before="0" w:beforeAutospacing="0" w:after="0" w:afterAutospacing="0" w:line="360" w:lineRule="auto"/>
+        <w:ind w:firstLine="709"/>
+        <w:rPr>
+          <w:sz w:val="28"/>
+          <w:szCs w:val="28"/>
+        </w:rPr>
+      </w:pPr>
+      <w:r>
+        <w:rPr>
+          <w:sz w:val="28"/>
+          <w:szCs w:val="28"/>
+        </w:rPr>
+        <w:t>Во время прохождения практики осуществлялось взаимодействие с сотрудниками организации по вопросам сопровождения информационных систем, настройки программного обеспечения и устранения возникающих ошибок.</w:t>
+      </w:r>
+    </w:p>
+    <w:p>
+      <w:pPr>
+        <w:pStyle w:val="aa"/>
+        <w:spacing w:before="0" w:beforeAutospacing="0" w:after="0" w:afterAutospacing="0" w:line="360" w:lineRule="auto"/>
+        <w:ind w:firstLine="709"/>
+        <w:rPr>
+          <w:sz w:val="28"/>
+          <w:szCs w:val="28"/>
+        </w:rPr>
+      </w:pPr>
+      <w:r>
+        <w:rPr>
+          <w:sz w:val="28"/>
+          <w:szCs w:val="28"/>
+        </w:rPr>
+        <w:t>Также проводилось обсуждение способов реализации отдельных функций API-приложения и методов обработки изображений, что позволило получить практический опыт сопровождения программных решений.</w:t>
+      </w:r>
+    </w:p>
+    <w:p>
+      <w:pPr>
+        <w:pStyle w:val="aa"/>
+        <w:spacing w:before="0" w:beforeAutospacing="0" w:after="0" w:afterAutospacing="0" w:line="480" w:lineRule="auto"/>
+        <w:ind w:firstLine="709"/>
+        <w:rPr>
+          <w:sz w:val="28"/>
+          <w:szCs w:val="28"/>
+        </w:rPr>
+      </w:pPr>
+    </w:p>
+    <w:p>
+      <w:pPr>
+        <w:pStyle w:val="aa"/>
+        <w:spacing w:before="0" w:beforeAutospacing="0" w:after="0" w:afterAutospacing="0" w:line="360" w:lineRule="auto"/>
+        <w:ind w:firstLine="709"/>
+        <w:rPr>
+          <w:sz w:val="28"/>
+          <w:szCs w:val="28"/>
+        </w:rPr>
+      </w:pPr>
+      <w:r>
+        <w:rPr>
+          <w:sz w:val="28"/>
+          <w:szCs w:val="28"/>
+        </w:rPr>
+        <w:t>2.7 Выявленные недостатки в процессе сопровождения ИС</w:t>
+      </w:r>
+    </w:p>
+    <w:p>
+      <w:pPr>
+        <w:pStyle w:val="aa"/>
+        <w:spacing w:before="0" w:beforeAutospacing="0" w:after="0" w:afterAutospacing="0" w:line="360" w:lineRule="auto"/>
+        <w:ind w:firstLine="709"/>
+        <w:rPr>
+          <w:sz w:val="28"/>
+          <w:szCs w:val="28"/>
+        </w:rPr>
+      </w:pPr>
+    </w:p>
+    <w:p>
+      <w:pPr>
+        <w:pStyle w:val="aa"/>
+        <w:spacing w:before="0" w:beforeAutospacing="0" w:after="0" w:afterAutospacing="0" w:line="360" w:lineRule="auto"/>
+        <w:ind w:firstLine="709"/>
+        <w:rPr>
+          <w:sz w:val="28"/>
+          <w:szCs w:val="28"/>
+        </w:rPr>
+      </w:pPr>
+      <w:r>
+        <w:rPr>
+          <w:sz w:val="28"/>
+          <w:szCs w:val="28"/>
+        </w:rPr>
+        <w:t>В процессе выполнения работы были выявлены отдельные недостатки, связанные с первоначальной настройкой среды разработки и зависимостей Python-библиотек.</w:t>
+      </w:r>
+    </w:p>
+    <w:p>
+      <w:pPr>
+        <w:pStyle w:val="aa"/>
+        <w:spacing w:before="0" w:beforeAutospacing="0" w:after="0" w:afterAutospacing="0" w:line="360" w:lineRule="auto"/>
+        <w:ind w:firstLine="709"/>
+        <w:rPr>
+          <w:sz w:val="28"/>
+          <w:szCs w:val="28"/>
+        </w:rPr>
+      </w:pPr>
+      <w:r>
+        <w:rPr>
+          <w:sz w:val="28"/>
+          <w:szCs w:val="28"/>
+        </w:rPr>
+        <w:t>Дополнительные трудности возникали при ручной проверке работоспособности API-методов после внесения изменений в программный код, что увеличивало время тестирования приложения.</w:t>
+      </w:r>
+    </w:p>
+    <w:p>
+      <w:pPr>
+        <w:pStyle w:val="aa"/>
+        <w:spacing w:before="0" w:beforeAutospacing="0" w:after="0" w:afterAutospacing="0" w:line="480" w:lineRule="auto"/>
+        <w:ind w:firstLine="709"/>
+        <w:rPr>
+          <w:sz w:val="28"/>
+          <w:szCs w:val="28"/>
+        </w:rPr>
+      </w:pPr>
+    </w:p>
+    <w:p>
+      <w:pPr>
+        <w:pStyle w:val="aa"/>
+        <w:spacing w:before="0" w:beforeAutospacing="0" w:after="0" w:afterAutospacing="0" w:line="360" w:lineRule="auto"/>
+        <w:ind w:firstLine="709"/>
+        <w:rPr>
+          <w:sz w:val="28"/>
+          <w:szCs w:val="28"/>
+        </w:rPr>
+      </w:pPr>
+      <w:r>
+        <w:rPr>
+          <w:sz w:val="28"/>
+          <w:szCs w:val="28"/>
+        </w:rPr>
+        <w:t>2.8 Рекомендации по улучшению</w:t>
+      </w:r>
+    </w:p>
+    <w:p>
+      <w:pPr>
+        <w:pStyle w:val="aa"/>
+        <w:spacing w:before="0" w:beforeAutospacing="0" w:after="0" w:afterAutospacing="0" w:line="360" w:lineRule="auto"/>
+        <w:ind w:firstLine="709"/>
+        <w:rPr>
+          <w:sz w:val="28"/>
+          <w:szCs w:val="28"/>
+        </w:rPr>
+      </w:pPr>
+    </w:p>
+    <w:p>
+      <w:pPr>
+        <w:pStyle w:val="aa"/>
+        <w:spacing w:before="0" w:beforeAutospacing="0" w:after="0" w:afterAutospacing="0" w:line="360" w:lineRule="auto"/>
+        <w:ind w:firstLine="709"/>
+        <w:rPr>
+          <w:sz w:val="28"/>
+          <w:szCs w:val="28"/>
+        </w:rPr>
+      </w:pPr>
+      <w:r>
+        <w:rPr>
+          <w:sz w:val="28"/>
+          <w:szCs w:val="28"/>
+        </w:rPr>
+        <w:t>Для повышения эффективности сопровождения информационных систем рекомендуется использовать автоматизированные средства тестирования API и более подробную техническую документацию проекта.</w:t>
+      </w:r>
+    </w:p>
+    <w:p>
+      <w:pPr>
+        <w:pStyle w:val="aa"/>
+        <w:spacing w:before="0" w:beforeAutospacing="0" w:after="0" w:afterAutospacing="0" w:line="360" w:lineRule="auto"/>
+        <w:ind w:firstLine="709"/>
+        <w:rPr>
+          <w:sz w:val="28"/>
+          <w:szCs w:val="28"/>
+        </w:rPr>
+      </w:pPr>
+      <w:r>
+        <w:rPr>
+          <w:sz w:val="28"/>
+          <w:szCs w:val="28"/>
+        </w:rPr>
+        <w:t>Также целесообразно расширить функциональные возможности приложения путем разработки пользовательского веб-интерфейса для загрузки и обработки изображений.</w:t>
+      </w:r>
+    </w:p>
+    <w:p>
+      <w:pPr>
+        <w:pStyle w:val="aa"/>
+        <w:spacing w:before="0" w:beforeAutospacing="0" w:after="0" w:afterAutospacing="0" w:line="360" w:lineRule="auto"/>
+        <w:ind w:firstLine="709"/>
+        <w:rPr>
+          <w:sz w:val="28"/>
+          <w:szCs w:val="28"/>
+        </w:rPr>
+      </w:pPr>
+    </w:p>
+    <w:p>
+      <w:pPr>
+        <w:pStyle w:val="aa"/>
+        <w:spacing w:before="0" w:beforeAutospacing="0" w:after="0" w:afterAutospacing="0" w:line="360" w:lineRule="auto"/>
+        <w:ind w:firstLine="709"/>
+        <w:rPr>
+          <w:sz w:val="28"/>
+          <w:szCs w:val="28"/>
+        </w:rPr>
+      </w:pPr>
+    </w:p>
+    <w:p>
+      <w:pPr>
+        <w:pStyle w:val="aa"/>
+        <w:spacing w:before="0" w:beforeAutospacing="0" w:after="0" w:afterAutospacing="0" w:line="360" w:lineRule="auto"/>
+        <w:ind w:firstLine="709"/>
+        <w:rPr>
+          <w:sz w:val="28"/>
+          <w:szCs w:val="28"/>
+        </w:rPr>
+      </w:pPr>
+      <w:r>
+        <w:rPr>
+          <w:sz w:val="28"/>
+          <w:szCs w:val="28"/>
+        </w:rPr>
+        <w:lastRenderedPageBreak/>
+        <w:t>2.9 Оценка эффективности текущих решений</w:t>
+      </w:r>
+    </w:p>
+    <w:p>
+      <w:pPr>
+        <w:pStyle w:val="aa"/>
+        <w:spacing w:before="0" w:beforeAutospacing="0" w:after="0" w:afterAutospacing="0" w:line="360" w:lineRule="auto"/>
+        <w:ind w:firstLine="709"/>
+        <w:rPr>
+          <w:sz w:val="28"/>
+          <w:szCs w:val="28"/>
+        </w:rPr>
+      </w:pPr>
+    </w:p>
+    <w:p>
+      <w:pPr>
+        <w:pStyle w:val="aa"/>
+        <w:spacing w:before="0" w:beforeAutospacing="0" w:after="0" w:afterAutospacing="0" w:line="360" w:lineRule="auto"/>
+        <w:ind w:firstLine="709"/>
+        <w:rPr>
+          <w:sz w:val="28"/>
+          <w:szCs w:val="28"/>
+        </w:rPr>
+      </w:pPr>
+      <w:r>
+        <w:rPr>
+          <w:sz w:val="28"/>
+          <w:szCs w:val="28"/>
+        </w:rPr>
+        <w:t>Используемые программные средства и технологии показали достаточную эффективность при разработке API-приложения. FastAPI обеспечил удобную реализацию Web API и автоматическое создание документации Swagger, а SQLite позволила быстро организовать хранение данных без необходимости настройки отдельного сервера базы данных.</w:t>
+      </w:r>
+    </w:p>
+    <w:p>
+      <w:pPr>
+        <w:pStyle w:val="aa"/>
+        <w:spacing w:before="0" w:beforeAutospacing="0" w:after="0" w:afterAutospacing="0" w:line="360" w:lineRule="auto"/>
+        <w:ind w:firstLine="709"/>
+        <w:rPr>
+          <w:sz w:val="28"/>
+          <w:szCs w:val="28"/>
+        </w:rPr>
+      </w:pPr>
+      <w:r>
+        <w:rPr>
+          <w:sz w:val="28"/>
+          <w:szCs w:val="28"/>
+        </w:rPr>
+        <w:t>Разработанное приложение успешно выполняет функции загрузки, хранения и обработки изображений и может быть использовано как основа для дальнейшего развития информационной системы.</w:t>
+      </w:r>
+    </w:p>
+    <w:p>
+      <w:pPr>
+        <w:pStyle w:val="aa"/>
+        <w:spacing w:before="0" w:beforeAutospacing="0" w:after="0" w:afterAutospacing="0" w:line="360" w:lineRule="auto"/>
+        <w:ind w:firstLine="709"/>
+        <w:rPr>
+          <w:sz w:val="28"/>
+          <w:szCs w:val="28"/>
+        </w:rPr>
+      </w:pPr>
+      <w:r>
+        <w:rPr>
+          <w:sz w:val="28"/>
+          <w:szCs w:val="28"/>
+        </w:rPr>
+        <w:t>Исходный код программы и дополнительные материалы представлены в приложении к отчету.</w:t>
+      </w:r>
+    </w:p>
+    <w:p>
+      <w:pPr>
+        <w:spacing w:after="0" w:line="360" w:lineRule="auto"/>
+        <w:ind w:left="709"/>
+        <w:rPr>
+          <w:rFonts w:ascii="Times New Roman" w:eastAsia="Aptos" w:hAnsi="Times New Roman" w:cs="Times New Roman"/>
+          <w:kern w:val="2"/>
+          <w:sz w:val="32"/>
+          <w:szCs w:val="32"/>
+          <w14:ligatures w14:val="standardContextual"/>
         </w:rPr>
       </w:pPr>
     </w:p>
@@ -11106,6 +12199,119 @@
     </w:lvl>
   </w:abstractNum>
   <w:abstractNum w:abstractNumId="14" w15:restartNumberingAfterBreak="0">
+    <w:nsid w:val="3C9C7AC7"/>
+    <w:multiLevelType w:val="hybridMultilevel"/>
+    <w:tmpl w:val="07BE5880"/>
+    <w:lvl w:ilvl="0" w:tplc="04190001">
+      <w:start w:val="1"/>
+      <w:numFmt w:val="bullet"/>
+      <w:lvlText w:val=""/>
+      <w:lvlJc w:val="left"/>
+      <w:pPr>
+        <w:ind w:left="1429" w:hanging="360"/>
+      </w:pPr>
+      <w:rPr>
+        <w:rFonts w:ascii="Symbol" w:hAnsi="Symbol" w:hint="default"/>
+      </w:rPr>
+    </w:lvl>
+    <w:lvl w:ilvl="1" w:tplc="04190003" w:tentative="1">
+      <w:start w:val="1"/>
+      <w:numFmt w:val="bullet"/>
+      <w:lvlText w:val="o"/>
+      <w:lvlJc w:val="left"/>
+      <w:pPr>
+        <w:ind w:left="2149" w:hanging="360"/>
+      </w:pPr>
+      <w:rPr>
+        <w:rFonts w:ascii="Courier New" w:hAnsi="Courier New" w:cs="Courier New" w:hint="default"/>
+      </w:rPr>
+    </w:lvl>
+    <w:lvl w:ilvl="2" w:tplc="04190005" w:tentative="1">
+      <w:start w:val="1"/>
+      <w:numFmt w:val="bullet"/>
+      <w:lvlText w:val=""/>
+      <w:lvlJc w:val="left"/>
+      <w:pPr>
+        <w:ind w:left="2869" w:hanging="360"/>
+      </w:pPr>
+      <w:rPr>
+        <w:rFonts w:ascii="Wingdings" w:hAnsi="Wingdings" w:hint="default"/>
+      </w:rPr>
+    </w:lvl>
+    <w:lvl w:ilvl="3" w:tplc="04190001" w:tentative="1">
+      <w:start w:val="1"/>
+      <w:numFmt w:val="bullet"/>
+      <w:lvlText w:val=""/>
+      <w:lvlJc w:val="left"/>
+      <w:pPr>
+        <w:ind w:left="3589" w:hanging="360"/>
+      </w:pPr>
+      <w:rPr>
+        <w:rFonts w:ascii="Symbol" w:hAnsi="Symbol" w:hint="default"/>
+      </w:rPr>
+    </w:lvl>
+    <w:lvl w:ilvl="4" w:tplc="04190003" w:tentative="1">
+      <w:start w:val="1"/>
+      <w:numFmt w:val="bullet"/>
+      <w:lvlText w:val="o"/>
+      <w:lvlJc w:val="left"/>
+      <w:pPr>
+        <w:ind w:left="4309" w:hanging="360"/>
+      </w:pPr>
+      <w:rPr>
+        <w:rFonts w:ascii="Courier New" w:hAnsi="Courier New" w:cs="Courier New" w:hint="default"/>
+      </w:rPr>
+    </w:lvl>
+    <w:lvl w:ilvl="5" w:tplc="04190005" w:tentative="1">
+      <w:start w:val="1"/>
+      <w:numFmt w:val="bullet"/>
+      <w:lvlText w:val=""/>
+      <w:lvlJc w:val="left"/>
+      <w:pPr>
+        <w:ind w:left="5029" w:hanging="360"/>
+      </w:pPr>
+      <w:rPr>
+        <w:rFonts w:ascii="Wingdings" w:hAnsi="Wingdings" w:hint="default"/>
+      </w:rPr>
+    </w:lvl>
+    <w:lvl w:ilvl="6" w:tplc="04190001" w:tentative="1">
+      <w:start w:val="1"/>
+      <w:numFmt w:val="bullet"/>
+      <w:lvlText w:val=""/>
+      <w:lvlJc w:val="left"/>
+      <w:pPr>
+        <w:ind w:left="5749" w:hanging="360"/>
+      </w:pPr>
+      <w:rPr>
+        <w:rFonts w:ascii="Symbol" w:hAnsi="Symbol" w:hint="default"/>
+      </w:rPr>
+    </w:lvl>
+    <w:lvl w:ilvl="7" w:tplc="04190003" w:tentative="1">
+      <w:start w:val="1"/>
+      <w:numFmt w:val="bullet"/>
+      <w:lvlText w:val="o"/>
+      <w:lvlJc w:val="left"/>
+      <w:pPr>
+        <w:ind w:left="6469" w:hanging="360"/>
+      </w:pPr>
+      <w:rPr>
+        <w:rFonts w:ascii="Courier New" w:hAnsi="Courier New" w:cs="Courier New" w:hint="default"/>
+      </w:rPr>
+    </w:lvl>
+    <w:lvl w:ilvl="8" w:tplc="04190005" w:tentative="1">
+      <w:start w:val="1"/>
+      <w:numFmt w:val="bullet"/>
+      <w:lvlText w:val=""/>
+      <w:lvlJc w:val="left"/>
+      <w:pPr>
+        <w:ind w:left="7189" w:hanging="360"/>
+      </w:pPr>
+      <w:rPr>
+        <w:rFonts w:ascii="Wingdings" w:hAnsi="Wingdings" w:hint="default"/>
+      </w:rPr>
+    </w:lvl>
+  </w:abstractNum>
+  <w:abstractNum w:abstractNumId="15" w15:restartNumberingAfterBreak="0">
     <w:nsid w:val="453540A0"/>
     <w:multiLevelType w:val="multilevel"/>
     <w:tmpl w:val="4BA45DB8"/>
@@ -11218,7 +12424,7 @@
       </w:rPr>
     </w:lvl>
   </w:abstractNum>
-  <w:abstractNum w:abstractNumId="15" w15:restartNumberingAfterBreak="0">
+  <w:abstractNum w:abstractNumId="16" w15:restartNumberingAfterBreak="0">
     <w:nsid w:val="4F61012B"/>
     <w:multiLevelType w:val="multilevel"/>
     <w:tmpl w:val="94A066CA"/>
@@ -11368,7 +12574,7 @@
       </w:rPr>
     </w:lvl>
   </w:abstractNum>
-  <w:abstractNum w:abstractNumId="16" w15:restartNumberingAfterBreak="0">
+  <w:abstractNum w:abstractNumId="17" w15:restartNumberingAfterBreak="0">
     <w:nsid w:val="5DB3624B"/>
     <w:multiLevelType w:val="multilevel"/>
     <w:tmpl w:val="4BA45DB8"/>
@@ -11481,7 +12687,7 @@
       </w:rPr>
     </w:lvl>
   </w:abstractNum>
-  <w:abstractNum w:abstractNumId="17" w15:restartNumberingAfterBreak="0">
+  <w:abstractNum w:abstractNumId="18" w15:restartNumberingAfterBreak="0">
     <w:nsid w:val="641700E0"/>
     <w:multiLevelType w:val="multilevel"/>
     <w:tmpl w:val="B91C19E4"/>
@@ -11630,7 +12836,7 @@
       </w:rPr>
     </w:lvl>
   </w:abstractNum>
-  <w:abstractNum w:abstractNumId="18" w15:restartNumberingAfterBreak="0">
+  <w:abstractNum w:abstractNumId="19" w15:restartNumberingAfterBreak="0">
     <w:nsid w:val="654A25C9"/>
     <w:multiLevelType w:val="multilevel"/>
     <w:tmpl w:val="0E02A8B8"/>
@@ -11779,7 +12985,7 @@
       </w:rPr>
     </w:lvl>
   </w:abstractNum>
-  <w:abstractNum w:abstractNumId="19" w15:restartNumberingAfterBreak="0">
+  <w:abstractNum w:abstractNumId="20" w15:restartNumberingAfterBreak="0">
     <w:nsid w:val="663F498E"/>
     <w:multiLevelType w:val="multilevel"/>
     <w:tmpl w:val="F7DC7C4A"/>
@@ -11928,7 +13134,120 @@
       </w:rPr>
     </w:lvl>
   </w:abstractNum>
-  <w:abstractNum w:abstractNumId="20" w15:restartNumberingAfterBreak="0">
+  <w:abstractNum w:abstractNumId="21" w15:restartNumberingAfterBreak="0">
+    <w:nsid w:val="66CB4B31"/>
+    <w:multiLevelType w:val="hybridMultilevel"/>
+    <w:tmpl w:val="CED2F0DC"/>
+    <w:lvl w:ilvl="0" w:tplc="375AEE30">
+      <w:start w:val="1"/>
+      <w:numFmt w:val="bullet"/>
+      <w:lvlText w:val=""/>
+      <w:lvlJc w:val="left"/>
+      <w:pPr>
+        <w:ind w:left="1429" w:hanging="360"/>
+      </w:pPr>
+      <w:rPr>
+        <w:rFonts w:ascii="Symbol" w:hAnsi="Symbol" w:hint="default"/>
+      </w:rPr>
+    </w:lvl>
+    <w:lvl w:ilvl="1" w:tplc="FFFFFFFF" w:tentative="1">
+      <w:start w:val="1"/>
+      <w:numFmt w:val="bullet"/>
+      <w:lvlText w:val="o"/>
+      <w:lvlJc w:val="left"/>
+      <w:pPr>
+        <w:ind w:left="2149" w:hanging="360"/>
+      </w:pPr>
+      <w:rPr>
+        <w:rFonts w:ascii="Courier New" w:hAnsi="Courier New" w:cs="Courier New" w:hint="default"/>
+      </w:rPr>
+    </w:lvl>
+    <w:lvl w:ilvl="2" w:tplc="FFFFFFFF" w:tentative="1">
+      <w:start w:val="1"/>
+      <w:numFmt w:val="bullet"/>
+      <w:lvlText w:val=""/>
+      <w:lvlJc w:val="left"/>
+      <w:pPr>
+        <w:ind w:left="2869" w:hanging="360"/>
+      </w:pPr>
+      <w:rPr>
+        <w:rFonts w:ascii="Wingdings" w:hAnsi="Wingdings" w:hint="default"/>
+      </w:rPr>
+    </w:lvl>
+    <w:lvl w:ilvl="3" w:tplc="FFFFFFFF" w:tentative="1">
+      <w:start w:val="1"/>
+      <w:numFmt w:val="bullet"/>
+      <w:lvlText w:val=""/>
+      <w:lvlJc w:val="left"/>
+      <w:pPr>
+        <w:ind w:left="3589" w:hanging="360"/>
+      </w:pPr>
+      <w:rPr>
+        <w:rFonts w:ascii="Symbol" w:hAnsi="Symbol" w:hint="default"/>
+      </w:rPr>
+    </w:lvl>
+    <w:lvl w:ilvl="4" w:tplc="FFFFFFFF" w:tentative="1">
+      <w:start w:val="1"/>
+      <w:numFmt w:val="bullet"/>
+      <w:lvlText w:val="o"/>
+      <w:lvlJc w:val="left"/>
+      <w:pPr>
+        <w:ind w:left="4309" w:hanging="360"/>
+      </w:pPr>
+      <w:rPr>
+        <w:rFonts w:ascii="Courier New" w:hAnsi="Courier New" w:cs="Courier New" w:hint="default"/>
+      </w:rPr>
+    </w:lvl>
+    <w:lvl w:ilvl="5" w:tplc="FFFFFFFF" w:tentative="1">
+      <w:start w:val="1"/>
+      <w:numFmt w:val="bullet"/>
+      <w:lvlText w:val=""/>
+      <w:lvlJc w:val="left"/>
+      <w:pPr>
+        <w:ind w:left="5029" w:hanging="360"/>
+      </w:pPr>
+      <w:rPr>
+        <w:rFonts w:ascii="Wingdings" w:hAnsi="Wingdings" w:hint="default"/>
+      </w:rPr>
+    </w:lvl>
+    <w:lvl w:ilvl="6" w:tplc="FFFFFFFF" w:tentative="1">
+      <w:start w:val="1"/>
+      <w:numFmt w:val="bullet"/>
+      <w:lvlText w:val=""/>
+      <w:lvlJc w:val="left"/>
+      <w:pPr>
+        <w:ind w:left="5749" w:hanging="360"/>
+      </w:pPr>
+      <w:rPr>
+        <w:rFonts w:ascii="Symbol" w:hAnsi="Symbol" w:hint="default"/>
+      </w:rPr>
+    </w:lvl>
+    <w:lvl w:ilvl="7" w:tplc="FFFFFFFF" w:tentative="1">
+      <w:start w:val="1"/>
+      <w:numFmt w:val="bullet"/>
+      <w:lvlText w:val="o"/>
+      <w:lvlJc w:val="left"/>
+      <w:pPr>
+        <w:ind w:left="6469" w:hanging="360"/>
+      </w:pPr>
+      <w:rPr>
+        <w:rFonts w:ascii="Courier New" w:hAnsi="Courier New" w:cs="Courier New" w:hint="default"/>
+      </w:rPr>
+    </w:lvl>
+    <w:lvl w:ilvl="8" w:tplc="FFFFFFFF" w:tentative="1">
+      <w:start w:val="1"/>
+      <w:numFmt w:val="bullet"/>
+      <w:lvlText w:val=""/>
+      <w:lvlJc w:val="left"/>
+      <w:pPr>
+        <w:ind w:left="7189" w:hanging="360"/>
+      </w:pPr>
+      <w:rPr>
+        <w:rFonts w:ascii="Wingdings" w:hAnsi="Wingdings" w:hint="default"/>
+      </w:rPr>
+    </w:lvl>
+  </w:abstractNum>
+  <w:abstractNum w:abstractNumId="22" w15:restartNumberingAfterBreak="0">
     <w:nsid w:val="68DB5425"/>
     <w:multiLevelType w:val="multilevel"/>
     <w:tmpl w:val="A8A4159A"/>
@@ -12077,7 +13396,7 @@
       </w:rPr>
     </w:lvl>
   </w:abstractNum>
-  <w:abstractNum w:abstractNumId="21" w15:restartNumberingAfterBreak="0">
+  <w:abstractNum w:abstractNumId="23" w15:restartNumberingAfterBreak="0">
     <w:nsid w:val="6FC64F07"/>
     <w:multiLevelType w:val="multilevel"/>
     <w:tmpl w:val="21C85A66"/>
@@ -12226,7 +13545,7 @@
       </w:rPr>
     </w:lvl>
   </w:abstractNum>
-  <w:abstractNum w:abstractNumId="22" w15:restartNumberingAfterBreak="0">
+  <w:abstractNum w:abstractNumId="24" w15:restartNumberingAfterBreak="0">
     <w:nsid w:val="70757AF2"/>
     <w:multiLevelType w:val="multilevel"/>
     <w:tmpl w:val="B2C83BF2"/>
@@ -12375,7 +13694,7 @@
       </w:rPr>
     </w:lvl>
   </w:abstractNum>
-  <w:abstractNum w:abstractNumId="23" w15:restartNumberingAfterBreak="0">
+  <w:abstractNum w:abstractNumId="25" w15:restartNumberingAfterBreak="0">
     <w:nsid w:val="71063FD5"/>
     <w:multiLevelType w:val="multilevel"/>
     <w:tmpl w:val="E1285A88"/>
@@ -12524,7 +13843,7 @@
       </w:rPr>
     </w:lvl>
   </w:abstractNum>
-  <w:abstractNum w:abstractNumId="24" w15:restartNumberingAfterBreak="0">
+  <w:abstractNum w:abstractNumId="26" w15:restartNumberingAfterBreak="0">
     <w:nsid w:val="738D4A58"/>
     <w:multiLevelType w:val="multilevel"/>
     <w:tmpl w:val="A296D8E2"/>
@@ -12645,7 +13964,7 @@
       </w:rPr>
     </w:lvl>
   </w:abstractNum>
-  <w:abstractNum w:abstractNumId="25" w15:restartNumberingAfterBreak="0">
+  <w:abstractNum w:abstractNumId="27" w15:restartNumberingAfterBreak="0">
     <w:nsid w:val="74F956D5"/>
     <w:multiLevelType w:val="hybridMultilevel"/>
     <w:tmpl w:val="D21893C0"/>
@@ -12758,7 +14077,7 @@
       </w:rPr>
     </w:lvl>
   </w:abstractNum>
-  <w:abstractNum w:abstractNumId="26" w15:restartNumberingAfterBreak="0">
+  <w:abstractNum w:abstractNumId="28" w15:restartNumberingAfterBreak="0">
     <w:nsid w:val="76142C0E"/>
     <w:multiLevelType w:val="hybridMultilevel"/>
     <w:tmpl w:val="96D62222"/>
@@ -12844,7 +14163,7 @@
       </w:pPr>
     </w:lvl>
   </w:abstractNum>
-  <w:abstractNum w:abstractNumId="27" w15:restartNumberingAfterBreak="0">
+  <w:abstractNum w:abstractNumId="29" w15:restartNumberingAfterBreak="0">
     <w:nsid w:val="77A243BE"/>
     <w:multiLevelType w:val="multilevel"/>
     <w:tmpl w:val="F6305B8C"/>
@@ -12993,7 +14312,7 @@
       </w:rPr>
     </w:lvl>
   </w:abstractNum>
-  <w:abstractNum w:abstractNumId="28" w15:restartNumberingAfterBreak="0">
+  <w:abstractNum w:abstractNumId="30" w15:restartNumberingAfterBreak="0">
     <w:nsid w:val="78DF5F90"/>
     <w:multiLevelType w:val="multilevel"/>
     <w:tmpl w:val="EA12626C"/>
@@ -13142,7 +14461,7 @@
       </w:rPr>
     </w:lvl>
   </w:abstractNum>
-  <w:abstractNum w:abstractNumId="29" w15:restartNumberingAfterBreak="0">
+  <w:abstractNum w:abstractNumId="31" w15:restartNumberingAfterBreak="0">
     <w:nsid w:val="7BFF38E4"/>
     <w:multiLevelType w:val="hybridMultilevel"/>
     <w:tmpl w:val="A63CF2D0"/>
@@ -13228,7 +14547,7 @@
       </w:pPr>
     </w:lvl>
   </w:abstractNum>
-  <w:abstractNum w:abstractNumId="30" w15:restartNumberingAfterBreak="0">
+  <w:abstractNum w:abstractNumId="32" w15:restartNumberingAfterBreak="0">
     <w:nsid w:val="7E7F1F6F"/>
     <w:multiLevelType w:val="hybridMultilevel"/>
     <w:tmpl w:val="17EE6F88"/>
@@ -13341,7 +14660,7 @@
       </w:rPr>
     </w:lvl>
   </w:abstractNum>
-  <w:abstractNum w:abstractNumId="31" w15:restartNumberingAfterBreak="0">
+  <w:abstractNum w:abstractNumId="33" w15:restartNumberingAfterBreak="0">
     <w:nsid w:val="7F7200C4"/>
     <w:multiLevelType w:val="multilevel"/>
     <w:tmpl w:val="1DB4EFB0"/>
@@ -13490,7 +14809,7 @@
       </w:rPr>
     </w:lvl>
   </w:abstractNum>
-  <w:abstractNum w:abstractNumId="32" w15:restartNumberingAfterBreak="0">
+  <w:abstractNum w:abstractNumId="34" w15:restartNumberingAfterBreak="0">
     <w:nsid w:val="7F814B28"/>
     <w:multiLevelType w:val="multilevel"/>
     <w:tmpl w:val="6A92CFE2"/>
@@ -13640,22 +14959,22 @@
     </w:lvl>
   </w:abstractNum>
   <w:num w:numId="1" w16cid:durableId="636106982">
-    <w:abstractNumId w:val="15"/>
+    <w:abstractNumId w:val="16"/>
   </w:num>
   <w:num w:numId="2" w16cid:durableId="1833376704">
-    <w:abstractNumId w:val="16"/>
+    <w:abstractNumId w:val="17"/>
   </w:num>
   <w:num w:numId="3" w16cid:durableId="420567623">
     <w:abstractNumId w:val="10"/>
   </w:num>
   <w:num w:numId="4" w16cid:durableId="733048048">
-    <w:abstractNumId w:val="25"/>
+    <w:abstractNumId w:val="27"/>
   </w:num>
   <w:num w:numId="5" w16cid:durableId="2034844247">
-    <w:abstractNumId w:val="14"/>
+    <w:abstractNumId w:val="15"/>
   </w:num>
   <w:num w:numId="6" w16cid:durableId="859978375">
-    <w:abstractNumId w:val="29"/>
+    <w:abstractNumId w:val="31"/>
   </w:num>
   <w:num w:numId="7" w16cid:durableId="1269192436">
     <w:abstractNumId w:val="2"/>
@@ -13664,40 +14983,40 @@
     <w:abstractNumId w:val="12"/>
   </w:num>
   <w:num w:numId="9" w16cid:durableId="1185049092">
-    <w:abstractNumId w:val="26"/>
+    <w:abstractNumId w:val="28"/>
   </w:num>
   <w:num w:numId="10" w16cid:durableId="1445156219">
-    <w:abstractNumId w:val="28"/>
+    <w:abstractNumId w:val="30"/>
   </w:num>
   <w:num w:numId="11" w16cid:durableId="797532465">
     <w:abstractNumId w:val="3"/>
   </w:num>
   <w:num w:numId="12" w16cid:durableId="936332128">
-    <w:abstractNumId w:val="20"/>
+    <w:abstractNumId w:val="22"/>
   </w:num>
   <w:num w:numId="13" w16cid:durableId="1038120784">
-    <w:abstractNumId w:val="19"/>
+    <w:abstractNumId w:val="20"/>
   </w:num>
   <w:num w:numId="14" w16cid:durableId="1612399009">
     <w:abstractNumId w:val="1"/>
   </w:num>
   <w:num w:numId="15" w16cid:durableId="1897667339">
-    <w:abstractNumId w:val="22"/>
+    <w:abstractNumId w:val="24"/>
   </w:num>
   <w:num w:numId="16" w16cid:durableId="1743018633">
     <w:abstractNumId w:val="11"/>
   </w:num>
   <w:num w:numId="17" w16cid:durableId="818570399">
-    <w:abstractNumId w:val="31"/>
+    <w:abstractNumId w:val="33"/>
   </w:num>
   <w:num w:numId="18" w16cid:durableId="1119447814">
-    <w:abstractNumId w:val="18"/>
+    <w:abstractNumId w:val="19"/>
   </w:num>
   <w:num w:numId="19" w16cid:durableId="345517592">
     <w:abstractNumId w:val="6"/>
   </w:num>
   <w:num w:numId="20" w16cid:durableId="1798836642">
-    <w:abstractNumId w:val="32"/>
+    <w:abstractNumId w:val="34"/>
   </w:num>
   <w:num w:numId="21" w16cid:durableId="1989943838">
     <w:abstractNumId w:val="9"/>
@@ -13709,13 +15028,13 @@
     <w:abstractNumId w:val="5"/>
   </w:num>
   <w:num w:numId="24" w16cid:durableId="1057362246">
-    <w:abstractNumId w:val="27"/>
+    <w:abstractNumId w:val="29"/>
   </w:num>
   <w:num w:numId="25" w16cid:durableId="1505897617">
-    <w:abstractNumId w:val="21"/>
+    <w:abstractNumId w:val="23"/>
   </w:num>
   <w:num w:numId="26" w16cid:durableId="1642073199">
-    <w:abstractNumId w:val="23"/>
+    <w:abstractNumId w:val="25"/>
   </w:num>
   <w:num w:numId="27" w16cid:durableId="1975521385">
     <w:abstractNumId w:val="7"/>
@@ -13724,19 +15043,25 @@
     <w:abstractNumId w:val="13"/>
   </w:num>
   <w:num w:numId="29" w16cid:durableId="1718238957">
-    <w:abstractNumId w:val="17"/>
+    <w:abstractNumId w:val="18"/>
   </w:num>
   <w:num w:numId="30" w16cid:durableId="327173263">
-    <w:abstractNumId w:val="24"/>
+    <w:abstractNumId w:val="26"/>
   </w:num>
   <w:num w:numId="31" w16cid:durableId="539243646">
-    <w:abstractNumId w:val="30"/>
+    <w:abstractNumId w:val="32"/>
   </w:num>
   <w:num w:numId="32" w16cid:durableId="1171067140">
     <w:abstractNumId w:val="8"/>
   </w:num>
   <w:num w:numId="33" w16cid:durableId="620888783">
     <w:abstractNumId w:val="4"/>
+  </w:num>
+  <w:num w:numId="34" w16cid:durableId="295067545">
+    <w:abstractNumId w:val="14"/>
+  </w:num>
+  <w:num w:numId="35" w16cid:durableId="1473913149">
+    <w:abstractNumId w:val="21"/>
   </w:num>
 </w:numbering>
 </file>
@@ -14168,7 +15493,6 @@
   <w:style w:type="character" w:default="1" w:styleId="a0">
     <w:name w:val="Default Paragraph Font"/>
     <w:uiPriority w:val="1"/>
-    <w:semiHidden/>
     <w:unhideWhenUsed/>
   </w:style>
   <w:style w:type="table" w:default="1" w:styleId="a1">
@@ -14330,6 +15654,23 @@
       <w:spacing w:after="100"/>
       <w:ind w:left="440"/>
     </w:pPr>
+  </w:style>
+  <w:style w:type="paragraph" w:styleId="aa">
+    <w:name w:val="Normal (Web)"/>
+    <w:basedOn w:val="a"/>
+    <w:uiPriority w:val="99"/>
+    <w:semiHidden/>
+    <w:unhideWhenUsed/>
+    <w:rsid w:val="00E17A0A"/>
+    <w:pPr>
+      <w:spacing w:before="100" w:beforeAutospacing="1" w:after="100" w:afterAutospacing="1" w:line="240" w:lineRule="auto"/>
+    </w:pPr>
+    <w:rPr>
+      <w:rFonts w:ascii="Times New Roman" w:eastAsia="Times New Roman" w:hAnsi="Times New Roman" w:cs="Times New Roman"/>
+      <w:sz w:val="24"/>
+      <w:szCs w:val="24"/>
+      <w:lang w:eastAsia="ru-RU"/>
+    </w:rPr>
   </w:style>
 </w:styles>
 </file>

</xml_diff>